<commit_message>
The lesson plan implemented totally
</commit_message>
<xml_diff>
--- a/01-decision-trees-random-forests/Demo_Lesson_plan_ Dilrabo_Khidirova.docx
+++ b/01-decision-trees-random-forests/Demo_Lesson_plan_ Dilrabo_Khidirova.docx
@@ -11598,6 +11598,220 @@
         </w:rPr>
       </w:pPr>
     </w:p>
+    <w:tbl>
+      <w:tblPr>
+        <w:tblW w:w="9360" w:type="dxa"/>
+        <w:tblBorders>
+          <w:top w:val="single" w:sz="4" w:space="0" w:color="auto"/>
+          <w:left w:val="single" w:sz="4" w:space="0" w:color="auto"/>
+          <w:bottom w:val="single" w:sz="4" w:space="0" w:color="auto"/>
+          <w:right w:val="single" w:sz="4" w:space="0" w:color="auto"/>
+          <w:insideH w:val="single" w:sz="4" w:space="0" w:color="auto"/>
+          <w:insideV w:val="single" w:sz="4" w:space="0" w:color="auto"/>
+        </w:tblBorders>
+        <w:tblCellMar>
+          <w:left w:w="10" w:type="dxa"/>
+          <w:right w:w="10" w:type="dxa"/>
+        </w:tblCellMar>
+        <w:tblLook w:val="04A0" w:firstRow="1" w:lastRow="0" w:firstColumn="1" w:lastColumn="0" w:noHBand="0" w:noVBand="1"/>
+      </w:tblPr>
+      <w:tblGrid>
+        <w:gridCol w:w="9360"/>
+      </w:tblGrid>
+      <w:tr>
+        <w:tc>
+          <w:tcPr>
+            <w:tcW w:w="9360" w:type="dxa"/>
+            <w:tcBorders>
+              <w:top w:val="single" w:sz="1" w:space="0" w:color="CCCCCC"/>
+              <w:left w:val="single" w:sz="1" w:space="0" w:color="CCCCCC"/>
+              <w:bottom w:val="single" w:sz="1" w:space="0" w:color="CCCCCC"/>
+              <w:right w:val="single" w:sz="1" w:space="0" w:color="CCCCCC"/>
+            </w:tcBorders>
+            <w:shd w:val="clear" w:color="auto" w:fill="854F0B"/>
+            <w:tcMar>
+              <w:top w:w="80" w:type="dxa"/>
+              <w:left w:w="160" w:type="dxa"/>
+              <w:bottom w:w="80" w:type="dxa"/>
+              <w:right w:w="160" w:type="dxa"/>
+            </w:tcMar>
+          </w:tcPr>
+          <w:p>
+            <w:pPr>
+              <w:jc w:val="both"/>
+              <w:rPr>
+                <w:sz w:val="28"/>
+                <w:szCs w:val="28"/>
+              </w:rPr>
+            </w:pPr>
+            <w:r>
+              <w:rPr>
+                <w:rFonts w:eastAsia="Arial"/>
+                <w:b/>
+                <w:bCs/>
+                <w:color w:val="FFFFFF"/>
+                <w:sz w:val="28"/>
+                <w:szCs w:val="28"/>
+              </w:rPr>
+              <w:t>TOOLS &amp; MATERIALS</w:t>
+            </w:r>
+          </w:p>
+        </w:tc>
+      </w:tr>
+      <w:tr>
+        <w:tc>
+          <w:tcPr>
+            <w:tcW w:w="9360" w:type="dxa"/>
+            <w:tcBorders>
+              <w:top w:val="single" w:sz="1" w:space="0" w:color="CCCCCC"/>
+              <w:left w:val="single" w:sz="1" w:space="0" w:color="CCCCCC"/>
+              <w:bottom w:val="single" w:sz="1" w:space="0" w:color="CCCCCC"/>
+              <w:right w:val="single" w:sz="1" w:space="0" w:color="CCCCCC"/>
+            </w:tcBorders>
+            <w:shd w:val="clear" w:color="auto" w:fill="FAEEDA"/>
+            <w:tcMar>
+              <w:top w:w="120" w:type="dxa"/>
+              <w:left w:w="180" w:type="dxa"/>
+              <w:bottom w:w="120" w:type="dxa"/>
+              <w:right w:w="180" w:type="dxa"/>
+            </w:tcMar>
+          </w:tcPr>
+          <w:p>
+            <w:pPr>
+              <w:spacing w:after="80"/>
+              <w:jc w:val="both"/>
+              <w:rPr>
+                <w:rFonts w:eastAsia="Arial"/>
+                <w:sz w:val="28"/>
+                <w:szCs w:val="28"/>
+              </w:rPr>
+            </w:pPr>
+            <w:r>
+              <w:rPr>
+                <w:rFonts w:eastAsia="Arial"/>
+                <w:sz w:val="28"/>
+                <w:szCs w:val="28"/>
+              </w:rPr>
+              <w:t xml:space="preserve">Notebook: </w:t>
+            </w:r>
+            <w:proofErr w:type="spellStart"/>
+            <w:r>
+              <w:rPr>
+                <w:rFonts w:eastAsia="Arial"/>
+                <w:sz w:val="28"/>
+                <w:szCs w:val="28"/>
+              </w:rPr>
+              <w:t>Jupyter</w:t>
+            </w:r>
+            <w:proofErr w:type="spellEnd"/>
+            <w:r>
+              <w:rPr>
+                <w:rFonts w:eastAsia="Arial"/>
+                <w:sz w:val="28"/>
+                <w:szCs w:val="28"/>
+              </w:rPr>
+              <w:t xml:space="preserve"> Notebook</w:t>
+            </w:r>
+          </w:p>
+          <w:p>
+            <w:pPr>
+              <w:spacing w:after="80"/>
+              <w:jc w:val="both"/>
+              <w:rPr>
+                <w:sz w:val="28"/>
+                <w:szCs w:val="28"/>
+              </w:rPr>
+            </w:pPr>
+            <w:r>
+              <w:rPr>
+                <w:sz w:val="28"/>
+                <w:szCs w:val="28"/>
+              </w:rPr>
+              <w:t>IDE: Windsurf</w:t>
+            </w:r>
+          </w:p>
+          <w:p>
+            <w:pPr>
+              <w:spacing w:after="80"/>
+              <w:jc w:val="both"/>
+              <w:rPr>
+                <w:sz w:val="28"/>
+                <w:szCs w:val="28"/>
+              </w:rPr>
+            </w:pPr>
+            <w:r>
+              <w:rPr>
+                <w:sz w:val="28"/>
+                <w:szCs w:val="28"/>
+              </w:rPr>
+              <w:t xml:space="preserve">Alternative: Kaggle, Google </w:t>
+            </w:r>
+            <w:proofErr w:type="spellStart"/>
+            <w:r>
+              <w:rPr>
+                <w:sz w:val="28"/>
+                <w:szCs w:val="28"/>
+              </w:rPr>
+              <w:t>Colab</w:t>
+            </w:r>
+            <w:proofErr w:type="spellEnd"/>
+          </w:p>
+          <w:p>
+            <w:pPr>
+              <w:spacing w:after="80"/>
+              <w:rPr>
+                <w:sz w:val="28"/>
+                <w:szCs w:val="28"/>
+              </w:rPr>
+            </w:pPr>
+            <w:r>
+              <w:rPr>
+                <w:rFonts w:eastAsia="Arial"/>
+                <w:sz w:val="28"/>
+                <w:szCs w:val="28"/>
+              </w:rPr>
+              <w:t>Location:</w:t>
+            </w:r>
+            <w:r>
+              <w:rPr>
+                <w:rFonts w:eastAsia="Arial"/>
+                <w:sz w:val="28"/>
+                <w:szCs w:val="28"/>
+              </w:rPr>
+              <w:t xml:space="preserve"> </w:t>
+            </w:r>
+            <w:hyperlink r:id="rId22" w:history="1">
+              <w:r>
+                <w:rPr>
+                  <w:rStyle w:val="Hyperlink"/>
+                  <w:rFonts w:eastAsia="Arial"/>
+                  <w:sz w:val="28"/>
+                  <w:szCs w:val="28"/>
+                </w:rPr>
+                <w:t>https://github.com/dilrabonu/ml-teaching-lab/tree/main/01-decision-trees-random-forests</w:t>
+              </w:r>
+            </w:hyperlink>
+            <w:r>
+              <w:rPr>
+                <w:rFonts w:eastAsia="Arial"/>
+                <w:sz w:val="28"/>
+                <w:szCs w:val="28"/>
+              </w:rPr>
+              <w:t xml:space="preserve"> </w:t>
+            </w:r>
+          </w:p>
+        </w:tc>
+      </w:tr>
+    </w:tbl>
+    <w:p>
+      <w:pPr>
+        <w:jc w:val="both"/>
+        <w:rPr>
+          <w:sz w:val="28"/>
+          <w:szCs w:val="28"/>
+        </w:rPr>
+      </w:pPr>
+    </w:p>
     <w:p>
       <w:pPr>
         <w:jc w:val="both"/>
@@ -11916,7 +12130,7 @@
           <w:sz w:val="28"/>
           <w:szCs w:val="28"/>
         </w:rPr>
-        <w:t xml:space="preserve">Slide 3 </w:t>
+        <w:t xml:space="preserve">Slide </w:t>
       </w:r>
       <w:r>
         <w:rPr>
@@ -11924,7 +12138,7 @@
           <w:sz w:val="28"/>
           <w:szCs w:val="28"/>
         </w:rPr>
-        <w:t>-</w:t>
+        <w:t>3</w:t>
       </w:r>
       <w:r>
         <w:rPr>
@@ -11932,31 +12146,7 @@
           <w:sz w:val="28"/>
           <w:szCs w:val="28"/>
         </w:rPr>
-        <w:t xml:space="preserve"> Open Ended: 'What 1 question do you still have?'</w:t>
-      </w:r>
-    </w:p>
-    <w:p>
-      <w:pPr>
-        <w:pStyle w:val="ListParagraph"/>
-        <w:numPr>
-          <w:ilvl w:val="0"/>
-          <w:numId w:val="34"/>
-        </w:numPr>
-        <w:spacing w:after="60"/>
-        <w:contextualSpacing w:val="0"/>
-        <w:jc w:val="both"/>
-        <w:rPr>
-          <w:sz w:val="28"/>
-          <w:szCs w:val="28"/>
-        </w:rPr>
-      </w:pPr>
-      <w:r>
-        <w:rPr>
-          <w:rFonts w:eastAsia="Arial"/>
-          <w:sz w:val="28"/>
-          <w:szCs w:val="28"/>
-        </w:rPr>
-        <w:t xml:space="preserve">Slide 4 </w:t>
+        <w:t xml:space="preserve"> </w:t>
       </w:r>
       <w:r>
         <w:rPr>
@@ -12435,6 +12625,156 @@
         </w:rPr>
       </w:pPr>
     </w:p>
+    <w:tbl>
+      <w:tblPr>
+        <w:tblW w:w="9360" w:type="dxa"/>
+        <w:tblBorders>
+          <w:top w:val="single" w:sz="4" w:space="0" w:color="auto"/>
+          <w:left w:val="single" w:sz="4" w:space="0" w:color="auto"/>
+          <w:bottom w:val="single" w:sz="4" w:space="0" w:color="auto"/>
+          <w:right w:val="single" w:sz="4" w:space="0" w:color="auto"/>
+          <w:insideH w:val="single" w:sz="4" w:space="0" w:color="auto"/>
+          <w:insideV w:val="single" w:sz="4" w:space="0" w:color="auto"/>
+        </w:tblBorders>
+        <w:tblCellMar>
+          <w:left w:w="10" w:type="dxa"/>
+          <w:right w:w="10" w:type="dxa"/>
+        </w:tblCellMar>
+        <w:tblLook w:val="04A0" w:firstRow="1" w:lastRow="0" w:firstColumn="1" w:lastColumn="0" w:noHBand="0" w:noVBand="1"/>
+      </w:tblPr>
+      <w:tblGrid>
+        <w:gridCol w:w="9360"/>
+      </w:tblGrid>
+      <w:tr>
+        <w:tc>
+          <w:tcPr>
+            <w:tcW w:w="9360" w:type="dxa"/>
+            <w:tcBorders>
+              <w:top w:val="single" w:sz="1" w:space="0" w:color="CCCCCC"/>
+              <w:left w:val="single" w:sz="1" w:space="0" w:color="CCCCCC"/>
+              <w:bottom w:val="single" w:sz="1" w:space="0" w:color="CCCCCC"/>
+              <w:right w:val="single" w:sz="1" w:space="0" w:color="CCCCCC"/>
+            </w:tcBorders>
+            <w:shd w:val="clear" w:color="auto" w:fill="854F0B"/>
+            <w:tcMar>
+              <w:top w:w="80" w:type="dxa"/>
+              <w:left w:w="160" w:type="dxa"/>
+              <w:bottom w:w="80" w:type="dxa"/>
+              <w:right w:w="160" w:type="dxa"/>
+            </w:tcMar>
+          </w:tcPr>
+          <w:p>
+            <w:pPr>
+              <w:jc w:val="both"/>
+              <w:rPr>
+                <w:sz w:val="28"/>
+                <w:szCs w:val="28"/>
+              </w:rPr>
+            </w:pPr>
+            <w:r>
+              <w:rPr>
+                <w:rFonts w:eastAsia="Arial"/>
+                <w:b/>
+                <w:bCs/>
+                <w:color w:val="FFFFFF"/>
+                <w:sz w:val="28"/>
+                <w:szCs w:val="28"/>
+              </w:rPr>
+              <w:t>TOOLS &amp; MATERIALS</w:t>
+            </w:r>
+          </w:p>
+        </w:tc>
+      </w:tr>
+      <w:tr>
+        <w:tc>
+          <w:tcPr>
+            <w:tcW w:w="9360" w:type="dxa"/>
+            <w:tcBorders>
+              <w:top w:val="single" w:sz="1" w:space="0" w:color="CCCCCC"/>
+              <w:left w:val="single" w:sz="1" w:space="0" w:color="CCCCCC"/>
+              <w:bottom w:val="single" w:sz="1" w:space="0" w:color="CCCCCC"/>
+              <w:right w:val="single" w:sz="1" w:space="0" w:color="CCCCCC"/>
+            </w:tcBorders>
+            <w:shd w:val="clear" w:color="auto" w:fill="FAEEDA"/>
+            <w:tcMar>
+              <w:top w:w="120" w:type="dxa"/>
+              <w:left w:w="180" w:type="dxa"/>
+              <w:bottom w:w="120" w:type="dxa"/>
+              <w:right w:w="180" w:type="dxa"/>
+            </w:tcMar>
+          </w:tcPr>
+          <w:p>
+            <w:pPr>
+              <w:spacing w:after="80"/>
+              <w:jc w:val="both"/>
+              <w:rPr>
+                <w:sz w:val="28"/>
+                <w:szCs w:val="28"/>
+              </w:rPr>
+            </w:pPr>
+            <w:proofErr w:type="spellStart"/>
+            <w:r>
+              <w:rPr>
+                <w:rFonts w:eastAsia="Arial"/>
+                <w:sz w:val="28"/>
+                <w:szCs w:val="28"/>
+              </w:rPr>
+              <w:t>Mentimeter</w:t>
+            </w:r>
+            <w:proofErr w:type="spellEnd"/>
+            <w:r>
+              <w:rPr>
+                <w:rFonts w:eastAsia="Arial"/>
+                <w:sz w:val="28"/>
+                <w:szCs w:val="28"/>
+              </w:rPr>
+              <w:t xml:space="preserve">: </w:t>
+            </w:r>
+            <w:hyperlink r:id="rId23" w:history="1">
+              <w:r>
+                <w:rPr>
+                  <w:rStyle w:val="Hyperlink"/>
+                  <w:rFonts w:eastAsia="Arial"/>
+                  <w:sz w:val="28"/>
+                  <w:szCs w:val="28"/>
+                </w:rPr>
+                <w:t>Link</w:t>
+              </w:r>
+            </w:hyperlink>
+            <w:r>
+              <w:rPr>
+                <w:rFonts w:eastAsia="Arial"/>
+                <w:sz w:val="28"/>
+                <w:szCs w:val="28"/>
+              </w:rPr>
+              <w:t xml:space="preserve">  8148 5386</w:t>
+            </w:r>
+            <w:r>
+              <w:rPr>
+                <w:rFonts w:eastAsia="Arial"/>
+                <w:sz w:val="28"/>
+                <w:szCs w:val="28"/>
+              </w:rPr>
+              <w:t xml:space="preserve"> </w:t>
+            </w:r>
+          </w:p>
+        </w:tc>
+      </w:tr>
+    </w:tbl>
+    <w:p>
+      <w:pPr>
+        <w:pStyle w:val="Heading2"/>
+        <w:jc w:val="both"/>
+        <w:rPr>
+          <w:rFonts w:ascii="Times New Roman" w:eastAsia="Arial"/>
+          <w:b/>
+          <w:bCs/>
+          <w:color w:val="2E75B6"/>
+          <w:sz w:val="28"/>
+          <w:szCs w:val="28"/>
+        </w:rPr>
+      </w:pPr>
+    </w:p>
     <w:p>
       <w:pPr>
         <w:pStyle w:val="Heading2"/>
@@ -12781,12 +13121,12 @@
       </w:pPr>
     </w:p>
     <w:sectPr>
-      <w:headerReference w:type="even" r:id="rId22"/>
-      <w:headerReference w:type="default" r:id="rId23"/>
-      <w:footerReference w:type="even" r:id="rId24"/>
-      <w:footerReference w:type="default" r:id="rId25"/>
-      <w:headerReference w:type="first" r:id="rId26"/>
-      <w:footerReference w:type="first" r:id="rId27"/>
+      <w:headerReference w:type="even" r:id="rId24"/>
+      <w:headerReference w:type="default" r:id="rId25"/>
+      <w:footerReference w:type="even" r:id="rId26"/>
+      <w:footerReference w:type="default" r:id="rId27"/>
+      <w:headerReference w:type="first" r:id="rId28"/>
+      <w:footerReference w:type="first" r:id="rId29"/>
       <w:pgSz w:w="11906" w:h="16838" w:code="9"/>
       <w:pgMar w:top="851" w:right="851" w:bottom="1134" w:left="1701" w:header="0" w:footer="510" w:gutter="0"/>
       <w:cols w:space="708"/>

</xml_diff>